<commit_message>
Cap nhat code va bao cao Bai 3 (Dieu khien 74HC595)
</commit_message>
<xml_diff>
--- a/Buoi1/Bao_cao_tong_hop_Buoi_1.docx
+++ b/Buoi1/Bao_cao_tong_hop_Buoi_1.docx
@@ -196,7 +196,7 @@
         <w:spacing w:before="20" w:after="40"/>
       </w:pPr>
       <w:r>
-        <w:t>Bước 5: Tại cửa sổ Manage Run-Time Environment, chọn Device -&gt; tích chọn Startup (hoặc Core, Framework, GPIO, RCC nếu dùng thư viện CMSIS) -&gt; Bấm Resolve (để hệ thống tự nạp các thư viện phụ thuộc) -&gt; Nhấn OK.</w:t>
+        <w:t>Bước 5: Tại cửa sổ Manage Run-Time Environment, chọn Device -&gt; tích chọn Startup (hoặc Core, Framework, GPIO, RCC nếu dùng thư viện CMSIS) -&gt; Bấm Resolve -&gt; Nhấn OK.</w:t>
       </w:r>
     </w:p>
     <w:p>
@@ -267,7 +267,7 @@
         <w:spacing w:before="20" w:after="40"/>
       </w:pPr>
       <w:r>
-        <w:t>Chân điều khiển: PC13 (kết nối trực tiếp với LED tích hợp sẵn trên bo mạch Blue Pill).</w:t>
+        <w:t>Chân điều khiển: PC13 (kết nối trực tiếp với LED tích hợp sẵn trên bo mạch Blue Pill, tích cực mức thấp).</w:t>
       </w:r>
     </w:p>
     <w:p>
@@ -806,17 +806,25 @@
               <w:t>#include "stm32f10x.h"</w:t>
               <w:br/>
               <w:br/>
-              <w:t>// Hàm trễ mili-giây</w:t>
+              <w:t>// ham delay</w:t>
               <w:br/>
-              <w:t>void delay(uint32_t ms)</w:t>
+              <w:t>void delay(uint32_t time)</w:t>
               <w:br/>
               <w:t>{</w:t>
               <w:br/>
-              <w:t xml:space="preserve">    while (ms--)</w:t>
+              <w:t xml:space="preserve">    while(time)</w:t>
               <w:br/>
               <w:t xml:space="preserve">    {</w:t>
               <w:br/>
-              <w:t xml:space="preserve">        for (volatile uint32_t i = 0; i &lt; 12000; i++);</w:t>
+              <w:t xml:space="preserve">        SysTick-&gt;CTRL = 5;</w:t>
+              <w:br/>
+              <w:t xml:space="preserve">        SysTick-&gt;VAL = 0;</w:t>
+              <w:br/>
+              <w:t xml:space="preserve">        SysTick-&gt;LOAD = 72000 - 1;</w:t>
+              <w:br/>
+              <w:t xml:space="preserve">        while(!(SysTick-&gt;CTRL &amp; (1 &lt;&lt; 16)));</w:t>
+              <w:br/>
+              <w:t xml:space="preserve">        time--;</w:t>
               <w:br/>
               <w:t xml:space="preserve">    }</w:t>
               <w:br/>
@@ -827,109 +835,110 @@
               <w:br/>
               <w:t>{</w:t>
               <w:br/>
-              <w:t xml:space="preserve">    // Cấp xung nhịp cho GPIOA</w:t>
+              <w:t xml:space="preserve">    //PA0</w:t>
               <w:br/>
-              <w:t xml:space="preserve">    RCC-&gt;APB2ENR |= (1 &lt;&lt; 2);</w:t>
+              <w:t xml:space="preserve">    RCC-&gt;APB2ENR |= (1 &lt;&lt; 2);           //cap xung</w:t>
+              <w:br/>
+              <w:t xml:space="preserve">    GPIOA-&gt;CRL &amp;= ~(0b1111 &lt;&lt; 0);        //xoa trang thai cu</w:t>
+              <w:br/>
+              <w:t xml:space="preserve">    GPIOA-&gt;CRL |=  (0b0011 &lt;&lt; 0);        //dat trang thai</w:t>
               <w:br/>
               <w:br/>
-              <w:t xml:space="preserve">    // Cấu hình PA0 (SH_CP - Xung dịch): Output Push-Pull 50MHz</w:t>
+              <w:t xml:space="preserve">    //PA1</w:t>
               <w:br/>
-              <w:t xml:space="preserve">    GPIOA-&gt;CRL &amp;= ~(0b1111 &lt;&lt; 0);</w:t>
+              <w:t xml:space="preserve">    GPIOA-&gt;CRL &amp;= ~(0b1111 &lt;&lt; 4);       //xoa trang thai cu</w:t>
               <w:br/>
-              <w:t xml:space="preserve">    GPIOA-&gt;CRL |=  (0b0011 &lt;&lt; 0);</w:t>
+              <w:t xml:space="preserve">    GPIOA-&gt;CRL |=  (0b0011 &lt;&lt; 4);       //dat trang thai moi</w:t>
               <w:br/>
               <w:br/>
-              <w:t xml:space="preserve">    // Cấu hình PA1 (DS - Dữ liệu nối tiếp): Output Push-Pull 50MHz</w:t>
+              <w:t xml:space="preserve">    //PA2</w:t>
               <w:br/>
-              <w:t xml:space="preserve">    GPIOA-&gt;CRL &amp;= ~(0b1111 &lt;&lt; 4);</w:t>
+              <w:t xml:space="preserve">    GPIOA-&gt;CRL &amp;= ~(0b1111 &lt;&lt; 8);       //xoa trang thai cu</w:t>
               <w:br/>
-              <w:t xml:space="preserve">    GPIOA-&gt;CRL |=  (0b0011 &lt;&lt; 4);</w:t>
+              <w:t xml:space="preserve">    GPIOA-&gt;CRL |=  (0b0011 &lt;&lt; 8);       //dat trang thai moi</w:t>
               <w:br/>
               <w:br/>
-              <w:t xml:space="preserve">    // Cấu hình PA2 (ST_CP - Xung chốt): Output Push-Pull 50MHz</w:t>
+              <w:t xml:space="preserve">    GPIOA-&gt;BSRR = (1 &lt;&lt; 16);</w:t>
               <w:br/>
-              <w:t xml:space="preserve">    GPIOA-&gt;CRL &amp;= ~(0b1111 &lt;&lt; 8);</w:t>
+              <w:t xml:space="preserve">    GPIOA-&gt;BSRR = (1 &lt;&lt; 17);</w:t>
               <w:br/>
-              <w:t xml:space="preserve">    GPIOA-&gt;CRL |=  (0b0011 &lt;&lt; 8);</w:t>
-              <w:br/>
-              <w:br/>
-              <w:t xml:space="preserve">    // Khởi tạo mức 0 ban đầu cho cả 3 chân</w:t>
-              <w:br/>
-              <w:t xml:space="preserve">    GPIOA-&gt;BSRR = (1 &lt;&lt; 16);             // PA0 = 0</w:t>
-              <w:br/>
-              <w:t xml:space="preserve">    GPIOA-&gt;BSRR = (1 &lt;&lt; 17);             // PA1 = 0</w:t>
-              <w:br/>
-              <w:t xml:space="preserve">    GPIOA-&gt;BSRR = (1 &lt;&lt; 18);             // PA2 = 0</w:t>
+              <w:t xml:space="preserve">    GPIOA-&gt;BSRR = (1 &lt;&lt; 18);</w:t>
               <w:br/>
               <w:br/>
               <w:t xml:space="preserve">    while (1)</w:t>
               <w:br/>
               <w:t xml:space="preserve">    {</w:t>
               <w:br/>
-              <w:t xml:space="preserve">        // ---------------- BẬT 8 LED (Gửi 8 bit 1) ----------------</w:t>
+              <w:t xml:space="preserve">        //bat led</w:t>
               <w:br/>
-              <w:t xml:space="preserve">        GPIOA-&gt;BSRR = (1 &lt;&lt; 1);          // Đặt chân DS (PA1) lên mức 1</w:t>
+              <w:t xml:space="preserve">        //PA1 = 1</w:t>
+              <w:br/>
+              <w:t xml:space="preserve">        GPIOA-&gt;BSRR = (1 &lt;&lt; 1);</w:t>
               <w:br/>
               <w:br/>
               <w:t xml:space="preserve">        for (int i = 0; i &lt; 8; i++)</w:t>
               <w:br/>
               <w:t xml:space="preserve">        {</w:t>
               <w:br/>
-              <w:t xml:space="preserve">            // Tạo xung sườn lên trên chân SH_CP (PA0) để dịch bit 1 vào thanh ghi</w:t>
+              <w:t xml:space="preserve">            //tao xung len PA0</w:t>
               <w:br/>
-              <w:t xml:space="preserve">            GPIOA-&gt;BSRR = (1 &lt;&lt; 16);     // PA0 = 0</w:t>
+              <w:t xml:space="preserve">            GPIOA-&gt;BSRR = (1 &lt;&lt; 16);</w:t>
               <w:br/>
-              <w:t xml:space="preserve">            GPIOA-&gt;BSRR = (1 &lt;&lt; 0);      // PA0 = 1 (sườn lên)</w:t>
+              <w:br/>
+              <w:t xml:space="preserve">            GPIOA-&gt;BSRR = (1 &lt;&lt; 0);</w:t>
+              <w:br/>
               <w:br/>
               <w:t xml:space="preserve">        }</w:t>
               <w:br/>
               <w:br/>
-              <w:t xml:space="preserve">        // Tạo xung chốt trên chân ST_CP (PA2) để xuất dữ liệu ra Q0-Q7</w:t>
-              <w:br/>
-              <w:t xml:space="preserve">        GPIOA-&gt;BSRR = (1 &lt;&lt; 18);         // PA2 = 0</w:t>
+              <w:t xml:space="preserve">        GPIOA-&gt;BSRR = (1 &lt;&lt; 18);</w:t>
               <w:br/>
               <w:t xml:space="preserve">        delay(1);</w:t>
               <w:br/>
-              <w:t xml:space="preserve">        GPIOA-&gt;BSRR = (1 &lt;&lt; 2);          // PA2 = 1 (sườn lên: Chốt dữ liệu)</w:t>
+              <w:t xml:space="preserve">        GPIOA-&gt;BSRR = (1 &lt;&lt; 2);</w:t>
               <w:br/>
               <w:t xml:space="preserve">        delay(1);</w:t>
               <w:br/>
-              <w:t xml:space="preserve">        GPIOA-&gt;BSRR = (1 &lt;&lt; 18);         // PA2 = 0</w:t>
-              <w:br/>
-              <w:t xml:space="preserve">        delay(500);</w:t>
+              <w:t xml:space="preserve">        GPIOA-&gt;BSRR = (1 &lt;&lt; 18);</w:t>
               <w:br/>
               <w:br/>
-              <w:t xml:space="preserve">        // ---------------- TẮT 8 LED (Gửi 8 bit 0) ----------------</w:t>
+              <w:t xml:space="preserve">        delay(50);</w:t>
               <w:br/>
-              <w:t xml:space="preserve">        GPIOA-&gt;BSRR = (1 &lt;&lt; 17);         // Đặt chân DS (PA1) về mức 0</w:t>
+              <w:br/>
+              <w:t xml:space="preserve">        //tat led</w:t>
+              <w:br/>
+              <w:t xml:space="preserve">        //PA1 = 0</w:t>
+              <w:br/>
+              <w:t xml:space="preserve">        GPIOA-&gt;BSRR = (1 &lt;&lt; 17);</w:t>
               <w:br/>
               <w:br/>
               <w:t xml:space="preserve">        for (int i = 0; i &lt; 8; i++)</w:t>
               <w:br/>
               <w:t xml:space="preserve">        {</w:t>
               <w:br/>
-              <w:t xml:space="preserve">            // Tạo xung sườn lên trên chân SH_CP (PA0) để dịch bit 0 vào thanh ghi</w:t>
+              <w:t xml:space="preserve">            //tao xung len PA0</w:t>
               <w:br/>
-              <w:t xml:space="preserve">            GPIOA-&gt;BSRR = (1 &lt;&lt; 16);     // PA0 = 0</w:t>
+              <w:t xml:space="preserve">            GPIOA-&gt;BSRR = (1 &lt;&lt; 16);</w:t>
               <w:br/>
-              <w:t xml:space="preserve">            GPIOA-&gt;BSRR = (1 &lt;&lt; 0);      // PA0 = 1 (sườn lên)</w:t>
+              <w:br/>
+              <w:t xml:space="preserve">            GPIOA-&gt;BSRR = (1 &lt;&lt; 0);</w:t>
+              <w:br/>
               <w:br/>
               <w:t xml:space="preserve">        }</w:t>
               <w:br/>
               <w:br/>
-              <w:t xml:space="preserve">        // Tạo xung chốt trên chân ST_CP (PA2) để xuất dữ liệu ra Q0-Q7</w:t>
-              <w:br/>
-              <w:t xml:space="preserve">        GPIOA-&gt;BSRR = (1 &lt;&lt; 18);         // PA2 = 0</w:t>
+              <w:t xml:space="preserve">        GPIOA-&gt;BSRR = (1 &lt;&lt; 18);</w:t>
               <w:br/>
               <w:t xml:space="preserve">        delay(1);</w:t>
               <w:br/>
-              <w:t xml:space="preserve">        GPIOA-&gt;BSRR = (1 &lt;&lt; 2);          // PA2 = 1 (sườn lên: Chốt dữ liệu)</w:t>
+              <w:t xml:space="preserve">        GPIOA-&gt;BSRR = (1 &lt;&lt; 2);</w:t>
               <w:br/>
               <w:t xml:space="preserve">        delay(1);</w:t>
               <w:br/>
-              <w:t xml:space="preserve">        GPIOA-&gt;BSRR = (1 &lt;&lt; 18);         // PA2 = 0</w:t>
+              <w:t xml:space="preserve">        GPIOA-&gt;BSRR = (1 &lt;&lt; 18);</w:t>
               <w:br/>
-              <w:t xml:space="preserve">        delay(500);</w:t>
+              <w:br/>
+              <w:t xml:space="preserve">        delay(50);</w:t>
               <w:br/>
               <w:t xml:space="preserve">    }</w:t>
               <w:br/>

</xml_diff>